<commit_message>
aulas - 2 e 3
</commit_message>
<xml_diff>
--- a/docs/antigas/Lista02-2026.docx
+++ b/docs/antigas/Lista02-2026.docx
@@ -919,8 +919,11 @@
     <w:p>
       <w:pPr>
         <w:pStyle w:val="Corpodetexto21"/>
+        <w:numPr>
+          <w:ilvl w:val="0"/>
+          <w:numId w:val="3"/>
+        </w:numPr>
         <w:spacing w:before="120"/>
-        <w:ind w:left="425" w:hanging="425"/>
         <w:rPr>
           <w:rFonts w:ascii="Book Antiqua" w:hAnsi="Book Antiqua"/>
           <w:sz w:val="20"/>
@@ -931,21 +934,14 @@
           <w:rFonts w:ascii="Book Antiqua" w:hAnsi="Book Antiqua"/>
           <w:sz w:val="20"/>
         </w:rPr>
-        <w:t>01</w:t>
-      </w:r>
-      <w:r>
-        <w:rPr>
-          <w:rFonts w:ascii="Book Antiqua" w:hAnsi="Book Antiqua"/>
-          <w:sz w:val="20"/>
-        </w:rPr>
-        <w:t xml:space="preserve">) </w:t>
-      </w:r>
-      <w:r>
-        <w:rPr>
-          <w:rFonts w:ascii="Book Antiqua" w:hAnsi="Book Antiqua"/>
-          <w:sz w:val="20"/>
-        </w:rPr>
-        <w:t>Suponha que se deseja comparar a eficiência de dois programas de investimento no desempenho financeiro de pequenas empresas. Para realizar o experimento, dispõe-se de 10 empresas com características semelhantes.</w:t>
+        <w:t xml:space="preserve">O índice de refração </w:t>
+      </w:r>
+      <w:r>
+        <w:rPr>
+          <w:rFonts w:ascii="Book Antiqua" w:hAnsi="Book Antiqua"/>
+          <w:sz w:val="20"/>
+        </w:rPr>
+        <w:t>de n = 15 pedaços de vidro, selecionados aleatoriamente de um grande lote amostrado</w:t>
       </w:r>
       <w:r>
         <w:rPr>
@@ -959,7 +955,524 @@
           <w:rFonts w:ascii="Book Antiqua" w:hAnsi="Book Antiqua"/>
           <w:sz w:val="20"/>
         </w:rPr>
-        <w:t>As empresas foram sorteadas aleatoriamente em dois grupos de cinco empresas. Um grupo recebeu o programa de investimento A, enquanto o outro recebeu o programa de investimento B.</w:t>
+        <w:t xml:space="preserve">de uma empresa de ótica, tem </w:t>
+      </w:r>
+      <w:r>
+        <w:rPr>
+          <w:rFonts w:ascii="Book Antiqua" w:hAnsi="Book Antiqua"/>
+          <w:sz w:val="20"/>
+        </w:rPr>
+        <w:t xml:space="preserve">um desvio padrão amostral de 0,012. Supondo que essas medidas podem ser entendidas como uma amostra de população normal, construa o intervalo de 95% confiança para </w:t>
+      </w:r>
+      <w:r>
+        <w:rPr>
+          <w:rFonts w:ascii="Symbol" w:hAnsi="Symbol"/>
+          <w:sz w:val="20"/>
+        </w:rPr>
+        <w:t>s</w:t>
+      </w:r>
+      <w:r>
+        <w:rPr>
+          <w:rFonts w:ascii="Book Antiqua" w:hAnsi="Book Antiqua"/>
+          <w:sz w:val="20"/>
+        </w:rPr>
+        <w:t xml:space="preserve">, o desvio padrão </w:t>
+      </w:r>
+      <w:r>
+        <w:rPr>
+          <w:rFonts w:ascii="Book Antiqua" w:hAnsi="Book Antiqua"/>
+          <w:sz w:val="20"/>
+        </w:rPr>
+        <w:t>do índice de refração dessa</w:t>
+      </w:r>
+      <w:r>
+        <w:rPr>
+          <w:rFonts w:ascii="Book Antiqua" w:hAnsi="Book Antiqua"/>
+          <w:sz w:val="20"/>
+        </w:rPr>
+        <w:t xml:space="preserve"> população.</w:t>
+      </w:r>
+    </w:p>
+    <w:p>
+      <w:pPr>
+        <w:pStyle w:val="Corpodetexto21"/>
+        <w:numPr>
+          <w:ilvl w:val="0"/>
+          <w:numId w:val="3"/>
+        </w:numPr>
+        <w:spacing w:before="120"/>
+        <w:rPr>
+          <w:rFonts w:ascii="Book Antiqua" w:hAnsi="Book Antiqua"/>
+          <w:sz w:val="20"/>
+        </w:rPr>
+      </w:pPr>
+      <w:r>
+        <w:rPr>
+          <w:rFonts w:ascii="Book Antiqua" w:hAnsi="Book Antiqua"/>
+          <w:sz w:val="20"/>
+        </w:rPr>
+        <w:t>Um serviço de teste de produtos de consumo quer estudar o nível de ruído de um novo aspirador de pó. Medindo o nível de ruído de n= 12 desses aparelhos, obteve-se os seguintes dados em decibéis.</w:t>
+      </w:r>
+    </w:p>
+    <w:tbl>
+      <w:tblPr>
+        <w:tblStyle w:val="Tabelacomgrade"/>
+        <w:tblW w:w="0" w:type="auto"/>
+        <w:tblInd w:w="426" w:type="dxa"/>
+        <w:tblLook w:val="04A0" w:firstRow="1" w:lastRow="0" w:firstColumn="1" w:lastColumn="0" w:noHBand="0" w:noVBand="1"/>
+      </w:tblPr>
+      <w:tblGrid>
+        <w:gridCol w:w="794"/>
+        <w:gridCol w:w="793"/>
+        <w:gridCol w:w="794"/>
+        <w:gridCol w:w="795"/>
+        <w:gridCol w:w="795"/>
+        <w:gridCol w:w="795"/>
+        <w:gridCol w:w="795"/>
+        <w:gridCol w:w="795"/>
+        <w:gridCol w:w="795"/>
+        <w:gridCol w:w="795"/>
+        <w:gridCol w:w="795"/>
+        <w:gridCol w:w="795"/>
+      </w:tblGrid>
+      <w:tr>
+        <w:tc>
+          <w:tcPr>
+            <w:tcW w:w="794" w:type="dxa"/>
+          </w:tcPr>
+          <w:p>
+            <w:pPr>
+              <w:pStyle w:val="Corpodetexto21"/>
+              <w:spacing w:before="120"/>
+              <w:ind w:left="0" w:firstLine="0"/>
+              <w:rPr>
+                <w:rFonts w:ascii="Book Antiqua" w:hAnsi="Book Antiqua"/>
+                <w:sz w:val="20"/>
+              </w:rPr>
+            </w:pPr>
+            <w:r>
+              <w:rPr>
+                <w:rFonts w:ascii="Book Antiqua" w:hAnsi="Book Antiqua"/>
+                <w:sz w:val="20"/>
+              </w:rPr>
+              <w:t>74,0</w:t>
+            </w:r>
+          </w:p>
+        </w:tc>
+        <w:tc>
+          <w:tcPr>
+            <w:tcW w:w="793" w:type="dxa"/>
+          </w:tcPr>
+          <w:p>
+            <w:pPr>
+              <w:pStyle w:val="Corpodetexto21"/>
+              <w:spacing w:before="120"/>
+              <w:ind w:left="0" w:firstLine="0"/>
+              <w:rPr>
+                <w:rFonts w:ascii="Book Antiqua" w:hAnsi="Book Antiqua"/>
+                <w:sz w:val="20"/>
+              </w:rPr>
+            </w:pPr>
+            <w:r>
+              <w:rPr>
+                <w:rFonts w:ascii="Book Antiqua" w:hAnsi="Book Antiqua"/>
+                <w:sz w:val="20"/>
+              </w:rPr>
+              <w:t>78,6</w:t>
+            </w:r>
+          </w:p>
+        </w:tc>
+        <w:tc>
+          <w:tcPr>
+            <w:tcW w:w="794" w:type="dxa"/>
+          </w:tcPr>
+          <w:p>
+            <w:pPr>
+              <w:pStyle w:val="Corpodetexto21"/>
+              <w:spacing w:before="120"/>
+              <w:ind w:left="0" w:firstLine="0"/>
+              <w:rPr>
+                <w:rFonts w:ascii="Book Antiqua" w:hAnsi="Book Antiqua"/>
+                <w:sz w:val="20"/>
+              </w:rPr>
+            </w:pPr>
+            <w:r>
+              <w:rPr>
+                <w:rFonts w:ascii="Book Antiqua" w:hAnsi="Book Antiqua"/>
+                <w:sz w:val="20"/>
+              </w:rPr>
+              <w:t>76,8</w:t>
+            </w:r>
+          </w:p>
+        </w:tc>
+        <w:tc>
+          <w:tcPr>
+            <w:tcW w:w="795" w:type="dxa"/>
+          </w:tcPr>
+          <w:p>
+            <w:pPr>
+              <w:pStyle w:val="Corpodetexto21"/>
+              <w:spacing w:before="120"/>
+              <w:ind w:left="0" w:firstLine="0"/>
+              <w:rPr>
+                <w:rFonts w:ascii="Book Antiqua" w:hAnsi="Book Antiqua"/>
+                <w:sz w:val="20"/>
+              </w:rPr>
+            </w:pPr>
+            <w:r>
+              <w:rPr>
+                <w:rFonts w:ascii="Book Antiqua" w:hAnsi="Book Antiqua"/>
+                <w:sz w:val="20"/>
+              </w:rPr>
+              <w:t>75,5</w:t>
+            </w:r>
+          </w:p>
+        </w:tc>
+        <w:tc>
+          <w:tcPr>
+            <w:tcW w:w="795" w:type="dxa"/>
+          </w:tcPr>
+          <w:p>
+            <w:pPr>
+              <w:pStyle w:val="Corpodetexto21"/>
+              <w:spacing w:before="120"/>
+              <w:ind w:left="0" w:firstLine="0"/>
+              <w:rPr>
+                <w:rFonts w:ascii="Book Antiqua" w:hAnsi="Book Antiqua"/>
+                <w:sz w:val="20"/>
+              </w:rPr>
+            </w:pPr>
+            <w:r>
+              <w:rPr>
+                <w:rFonts w:ascii="Book Antiqua" w:hAnsi="Book Antiqua"/>
+                <w:sz w:val="20"/>
+              </w:rPr>
+              <w:t>73,8</w:t>
+            </w:r>
+          </w:p>
+        </w:tc>
+        <w:tc>
+          <w:tcPr>
+            <w:tcW w:w="795" w:type="dxa"/>
+          </w:tcPr>
+          <w:p>
+            <w:pPr>
+              <w:pStyle w:val="Corpodetexto21"/>
+              <w:spacing w:before="120"/>
+              <w:ind w:left="0" w:firstLine="0"/>
+              <w:rPr>
+                <w:rFonts w:ascii="Book Antiqua" w:hAnsi="Book Antiqua"/>
+                <w:sz w:val="20"/>
+              </w:rPr>
+            </w:pPr>
+            <w:r>
+              <w:rPr>
+                <w:rFonts w:ascii="Book Antiqua" w:hAnsi="Book Antiqua"/>
+                <w:sz w:val="20"/>
+              </w:rPr>
+              <w:t>75,6</w:t>
+            </w:r>
+          </w:p>
+        </w:tc>
+        <w:tc>
+          <w:tcPr>
+            <w:tcW w:w="795" w:type="dxa"/>
+          </w:tcPr>
+          <w:p>
+            <w:pPr>
+              <w:pStyle w:val="Corpodetexto21"/>
+              <w:spacing w:before="120"/>
+              <w:ind w:left="0" w:firstLine="0"/>
+              <w:rPr>
+                <w:rFonts w:ascii="Book Antiqua" w:hAnsi="Book Antiqua"/>
+                <w:sz w:val="20"/>
+              </w:rPr>
+            </w:pPr>
+            <w:r>
+              <w:rPr>
+                <w:rFonts w:ascii="Book Antiqua" w:hAnsi="Book Antiqua"/>
+                <w:sz w:val="20"/>
+              </w:rPr>
+              <w:t>77,3</w:t>
+            </w:r>
+          </w:p>
+        </w:tc>
+        <w:tc>
+          <w:tcPr>
+            <w:tcW w:w="795" w:type="dxa"/>
+          </w:tcPr>
+          <w:p>
+            <w:pPr>
+              <w:pStyle w:val="Corpodetexto21"/>
+              <w:spacing w:before="120"/>
+              <w:ind w:left="0" w:firstLine="0"/>
+              <w:rPr>
+                <w:rFonts w:ascii="Book Antiqua" w:hAnsi="Book Antiqua"/>
+                <w:sz w:val="20"/>
+              </w:rPr>
+            </w:pPr>
+            <w:r>
+              <w:rPr>
+                <w:rFonts w:ascii="Book Antiqua" w:hAnsi="Book Antiqua"/>
+                <w:sz w:val="20"/>
+              </w:rPr>
+              <w:t>75,8</w:t>
+            </w:r>
+          </w:p>
+        </w:tc>
+        <w:tc>
+          <w:tcPr>
+            <w:tcW w:w="795" w:type="dxa"/>
+          </w:tcPr>
+          <w:p>
+            <w:pPr>
+              <w:pStyle w:val="Corpodetexto21"/>
+              <w:spacing w:before="120"/>
+              <w:ind w:left="0" w:firstLine="0"/>
+              <w:rPr>
+                <w:rFonts w:ascii="Book Antiqua" w:hAnsi="Book Antiqua"/>
+                <w:sz w:val="20"/>
+              </w:rPr>
+            </w:pPr>
+            <w:r>
+              <w:rPr>
+                <w:rFonts w:ascii="Book Antiqua" w:hAnsi="Book Antiqua"/>
+                <w:sz w:val="20"/>
+              </w:rPr>
+              <w:t>73,9</w:t>
+            </w:r>
+          </w:p>
+        </w:tc>
+        <w:tc>
+          <w:tcPr>
+            <w:tcW w:w="795" w:type="dxa"/>
+          </w:tcPr>
+          <w:p>
+            <w:pPr>
+              <w:pStyle w:val="Corpodetexto21"/>
+              <w:spacing w:before="120"/>
+              <w:ind w:left="0" w:firstLine="0"/>
+              <w:rPr>
+                <w:rFonts w:ascii="Book Antiqua" w:hAnsi="Book Antiqua"/>
+                <w:sz w:val="20"/>
+              </w:rPr>
+            </w:pPr>
+            <w:r>
+              <w:rPr>
+                <w:rFonts w:ascii="Book Antiqua" w:hAnsi="Book Antiqua"/>
+                <w:sz w:val="20"/>
+              </w:rPr>
+              <w:t>70,2</w:t>
+            </w:r>
+          </w:p>
+        </w:tc>
+        <w:tc>
+          <w:tcPr>
+            <w:tcW w:w="795" w:type="dxa"/>
+          </w:tcPr>
+          <w:p>
+            <w:pPr>
+              <w:pStyle w:val="Corpodetexto21"/>
+              <w:spacing w:before="120"/>
+              <w:ind w:left="0" w:firstLine="0"/>
+              <w:rPr>
+                <w:rFonts w:ascii="Book Antiqua" w:hAnsi="Book Antiqua"/>
+                <w:sz w:val="20"/>
+              </w:rPr>
+            </w:pPr>
+            <w:r>
+              <w:rPr>
+                <w:rFonts w:ascii="Book Antiqua" w:hAnsi="Book Antiqua"/>
+                <w:sz w:val="20"/>
+              </w:rPr>
+              <w:t>81,0</w:t>
+            </w:r>
+          </w:p>
+        </w:tc>
+        <w:tc>
+          <w:tcPr>
+            <w:tcW w:w="795" w:type="dxa"/>
+          </w:tcPr>
+          <w:p>
+            <w:pPr>
+              <w:pStyle w:val="Corpodetexto21"/>
+              <w:spacing w:before="120"/>
+              <w:ind w:left="0" w:firstLine="0"/>
+              <w:rPr>
+                <w:rFonts w:ascii="Book Antiqua" w:hAnsi="Book Antiqua"/>
+                <w:sz w:val="20"/>
+              </w:rPr>
+            </w:pPr>
+            <w:r>
+              <w:rPr>
+                <w:rFonts w:ascii="Book Antiqua" w:hAnsi="Book Antiqua"/>
+                <w:sz w:val="20"/>
+              </w:rPr>
+              <w:t>73,9</w:t>
+            </w:r>
+          </w:p>
+        </w:tc>
+      </w:tr>
+    </w:tbl>
+    <w:p>
+      <w:pPr>
+        <w:pStyle w:val="Corpodetexto21"/>
+        <w:numPr>
+          <w:ilvl w:val="0"/>
+          <w:numId w:val="4"/>
+        </w:numPr>
+        <w:spacing w:before="120"/>
+        <w:rPr>
+          <w:rFonts w:ascii="Book Antiqua" w:hAnsi="Book Antiqua"/>
+          <w:sz w:val="20"/>
+        </w:rPr>
+      </w:pPr>
+      <w:r>
+        <w:rPr>
+          <w:rFonts w:ascii="Book Antiqua" w:hAnsi="Book Antiqua"/>
+          <w:sz w:val="20"/>
+        </w:rPr>
+        <w:t>Construa um intervalo de 95% de confiança para o nível de ruído médio (</w:t>
+      </w:r>
+      <w:r>
+        <w:rPr>
+          <w:rFonts w:ascii="Symbol" w:hAnsi="Symbol"/>
+          <w:sz w:val="20"/>
+        </w:rPr>
+        <w:t>m</w:t>
+      </w:r>
+      <w:r>
+        <w:rPr>
+          <w:rFonts w:ascii="Book Antiqua" w:hAnsi="Book Antiqua"/>
+          <w:sz w:val="20"/>
+        </w:rPr>
+        <w:t>) de tais aspiradores de pó.</w:t>
+      </w:r>
+    </w:p>
+    <w:p>
+      <w:pPr>
+        <w:pStyle w:val="Corpodetexto21"/>
+        <w:numPr>
+          <w:ilvl w:val="0"/>
+          <w:numId w:val="4"/>
+        </w:numPr>
+        <w:spacing w:before="120"/>
+        <w:rPr>
+          <w:rFonts w:ascii="Book Antiqua" w:hAnsi="Book Antiqua"/>
+          <w:sz w:val="20"/>
+        </w:rPr>
+      </w:pPr>
+      <w:r>
+        <w:rPr>
+          <w:rFonts w:ascii="Book Antiqua" w:hAnsi="Book Antiqua"/>
+          <w:sz w:val="20"/>
+        </w:rPr>
+        <w:t>Construa um intervalo de 99% de confiança para o desvio padrão populacional (</w:t>
+      </w:r>
+      <w:r>
+        <w:rPr>
+          <w:rFonts w:ascii="Symbol" w:hAnsi="Symbol"/>
+          <w:sz w:val="20"/>
+        </w:rPr>
+        <w:t>s</w:t>
+      </w:r>
+      <w:r>
+        <w:rPr>
+          <w:rFonts w:ascii="Book Antiqua" w:hAnsi="Book Antiqua"/>
+          <w:sz w:val="20"/>
+        </w:rPr>
+        <w:t>), que mede a variabilidade do nível de ruído dos aspiradores de pó.</w:t>
+      </w:r>
+    </w:p>
+    <w:p>
+      <w:pPr>
+        <w:pStyle w:val="Corpodetexto21"/>
+        <w:numPr>
+          <w:ilvl w:val="0"/>
+          <w:numId w:val="3"/>
+        </w:numPr>
+        <w:spacing w:before="120"/>
+        <w:rPr>
+          <w:rFonts w:ascii="Book Antiqua" w:hAnsi="Book Antiqua"/>
+          <w:sz w:val="20"/>
+        </w:rPr>
+      </w:pPr>
+      <w:r>
+        <w:rPr>
+          <w:rFonts w:ascii="Book Antiqua" w:hAnsi="Book Antiqua"/>
+          <w:sz w:val="20"/>
+        </w:rPr>
+        <w:t>Em sete estações climáticas na Serra do Mar, o nível de precipitação durante uma tempestade de verão foi medido em 12, 14, 18, 20, 15, 12, e 14 mm. Supondo que esses dados sejam provenientes de uma população normal, construa um intervalo de 9</w:t>
+      </w:r>
+      <w:r>
+        <w:rPr>
+          <w:rFonts w:ascii="Book Antiqua" w:hAnsi="Book Antiqua"/>
+          <w:sz w:val="20"/>
+        </w:rPr>
+        <w:t>0</w:t>
+      </w:r>
+      <w:r>
+        <w:rPr>
+          <w:rFonts w:ascii="Book Antiqua" w:hAnsi="Book Antiqua"/>
+          <w:sz w:val="20"/>
+        </w:rPr>
+        <w:t>% de confiança para o nível de precipitação médio (m) e o desvio padrão (</w:t>
+      </w:r>
+      <w:r>
+        <w:rPr>
+          <w:rFonts w:ascii="Symbol" w:hAnsi="Symbol"/>
+          <w:sz w:val="20"/>
+        </w:rPr>
+        <w:t>s</w:t>
+      </w:r>
+      <w:r>
+        <w:rPr>
+          <w:rFonts w:ascii="Book Antiqua" w:hAnsi="Book Antiqua"/>
+          <w:sz w:val="20"/>
+        </w:rPr>
+        <w:t>) da precipitação em tempestades de verão na Serra do mar.</w:t>
+      </w:r>
+    </w:p>
+    <w:p>
+      <w:pPr>
+        <w:pStyle w:val="Corpodetexto21"/>
+        <w:numPr>
+          <w:ilvl w:val="0"/>
+          <w:numId w:val="3"/>
+        </w:numPr>
+        <w:spacing w:before="120"/>
+        <w:rPr>
+          <w:rFonts w:ascii="Book Antiqua" w:hAnsi="Book Antiqua"/>
+          <w:sz w:val="20"/>
+        </w:rPr>
+      </w:pPr>
+      <w:r>
+        <w:rPr>
+          <w:rFonts w:ascii="Book Antiqua" w:hAnsi="Book Antiqua"/>
+          <w:sz w:val="20"/>
+        </w:rPr>
+        <w:t xml:space="preserve">Utilizando as informações fornecidas na tabela de contingência a seguir, que é o resultado de um levantamento amostral conduzido na faculdade, decida </w:t>
+      </w:r>
+      <w:r>
+        <w:rPr>
+          <w:rFonts w:ascii="Book Antiqua" w:hAnsi="Book Antiqua"/>
+          <w:sz w:val="20"/>
+        </w:rPr>
+        <w:t xml:space="preserve">se </w:t>
+      </w:r>
+      <w:r>
+        <w:rPr>
+          <w:rFonts w:ascii="Book Antiqua" w:hAnsi="Book Antiqua"/>
+          <w:sz w:val="20"/>
+        </w:rPr>
+        <w:t>o interesse e a capacidade do</w:t>
+      </w:r>
+      <w:r>
+        <w:rPr>
+          <w:rFonts w:ascii="Book Antiqua" w:hAnsi="Book Antiqua"/>
+          <w:sz w:val="20"/>
+        </w:rPr>
+        <w:t>s</w:t>
       </w:r>
       <w:r>
         <w:rPr>
@@ -973,7 +1486,1436 @@
           <w:rFonts w:ascii="Book Antiqua" w:hAnsi="Book Antiqua"/>
           <w:sz w:val="20"/>
         </w:rPr>
-        <w:t>A eficiência dos programas foi avaliada pelo crescimento percentual do faturamento de cada empresa durante determinado período</w:t>
+        <w:t>alunos</w:t>
+      </w:r>
+      <w:r>
+        <w:rPr>
+          <w:rFonts w:ascii="Book Antiqua" w:hAnsi="Book Antiqua"/>
+          <w:sz w:val="20"/>
+        </w:rPr>
+        <w:t xml:space="preserve"> em estudar uma língua estrangeira, são independentes ao nível de 0,05 de significância.</w:t>
+      </w:r>
+    </w:p>
+    <w:tbl>
+      <w:tblPr>
+        <w:tblStyle w:val="Tabelacomgrade"/>
+        <w:tblW w:w="0" w:type="auto"/>
+        <w:tblInd w:w="1838" w:type="dxa"/>
+        <w:tblLook w:val="04A0" w:firstRow="1" w:lastRow="0" w:firstColumn="1" w:lastColumn="0" w:noHBand="0" w:noVBand="1"/>
+      </w:tblPr>
+      <w:tblGrid>
+        <w:gridCol w:w="478"/>
+        <w:gridCol w:w="1130"/>
+        <w:gridCol w:w="1690"/>
+        <w:gridCol w:w="1830"/>
+        <w:gridCol w:w="1968"/>
+        <w:gridCol w:w="1028"/>
+      </w:tblGrid>
+      <w:tr>
+        <w:tc>
+          <w:tcPr>
+            <w:tcW w:w="1559" w:type="dxa"/>
+            <w:gridSpan w:val="2"/>
+            <w:vMerge w:val="restart"/>
+          </w:tcPr>
+          <w:p>
+            <w:pPr>
+              <w:pStyle w:val="Corpodetexto21"/>
+              <w:ind w:left="0" w:firstLine="0"/>
+              <w:rPr>
+                <w:rFonts w:ascii="Book Antiqua" w:hAnsi="Book Antiqua"/>
+                <w:sz w:val="20"/>
+              </w:rPr>
+            </w:pPr>
+          </w:p>
+        </w:tc>
+        <w:tc>
+          <w:tcPr>
+            <w:tcW w:w="5529" w:type="dxa"/>
+            <w:gridSpan w:val="3"/>
+          </w:tcPr>
+          <w:p>
+            <w:pPr>
+              <w:pStyle w:val="Corpodetexto21"/>
+              <w:ind w:left="0" w:firstLine="0"/>
+              <w:jc w:val="center"/>
+              <w:rPr>
+                <w:rFonts w:ascii="Book Antiqua" w:hAnsi="Book Antiqua"/>
+                <w:sz w:val="20"/>
+              </w:rPr>
+            </w:pPr>
+            <w:r>
+              <w:rPr>
+                <w:rFonts w:ascii="Book Antiqua" w:hAnsi="Book Antiqua"/>
+                <w:sz w:val="20"/>
+              </w:rPr>
+              <w:t>Capacidade</w:t>
+            </w:r>
+          </w:p>
+        </w:tc>
+        <w:tc>
+          <w:tcPr>
+            <w:tcW w:w="1036" w:type="dxa"/>
+          </w:tcPr>
+          <w:p>
+            <w:pPr>
+              <w:pStyle w:val="Corpodetexto21"/>
+              <w:ind w:left="0" w:firstLine="0"/>
+              <w:rPr>
+                <w:rFonts w:ascii="Book Antiqua" w:hAnsi="Book Antiqua"/>
+                <w:sz w:val="20"/>
+              </w:rPr>
+            </w:pPr>
+          </w:p>
+        </w:tc>
+      </w:tr>
+      <w:tr>
+        <w:tc>
+          <w:tcPr>
+            <w:tcW w:w="1559" w:type="dxa"/>
+            <w:gridSpan w:val="2"/>
+            <w:vMerge/>
+          </w:tcPr>
+          <w:p>
+            <w:pPr>
+              <w:pStyle w:val="Corpodetexto21"/>
+              <w:ind w:left="0" w:firstLine="0"/>
+              <w:rPr>
+                <w:rFonts w:ascii="Book Antiqua" w:hAnsi="Book Antiqua"/>
+                <w:sz w:val="20"/>
+              </w:rPr>
+            </w:pPr>
+          </w:p>
+        </w:tc>
+        <w:tc>
+          <w:tcPr>
+            <w:tcW w:w="1701" w:type="dxa"/>
+          </w:tcPr>
+          <w:p>
+            <w:pPr>
+              <w:pStyle w:val="Corpodetexto21"/>
+              <w:ind w:left="0" w:firstLine="0"/>
+              <w:jc w:val="center"/>
+              <w:rPr>
+                <w:rFonts w:ascii="Book Antiqua" w:hAnsi="Book Antiqua"/>
+                <w:sz w:val="20"/>
+              </w:rPr>
+            </w:pPr>
+            <w:r>
+              <w:rPr>
+                <w:rFonts w:ascii="Book Antiqua" w:hAnsi="Book Antiqua"/>
+                <w:sz w:val="20"/>
+              </w:rPr>
+              <w:t>Pouca</w:t>
+            </w:r>
+          </w:p>
+        </w:tc>
+        <w:tc>
+          <w:tcPr>
+            <w:tcW w:w="1843" w:type="dxa"/>
+          </w:tcPr>
+          <w:p>
+            <w:pPr>
+              <w:pStyle w:val="Corpodetexto21"/>
+              <w:ind w:left="0" w:firstLine="0"/>
+              <w:jc w:val="center"/>
+              <w:rPr>
+                <w:rFonts w:ascii="Book Antiqua" w:hAnsi="Book Antiqua"/>
+                <w:sz w:val="20"/>
+              </w:rPr>
+            </w:pPr>
+            <w:r>
+              <w:rPr>
+                <w:rFonts w:ascii="Book Antiqua" w:hAnsi="Book Antiqua"/>
+                <w:sz w:val="20"/>
+              </w:rPr>
+              <w:t>Média</w:t>
+            </w:r>
+          </w:p>
+        </w:tc>
+        <w:tc>
+          <w:tcPr>
+            <w:tcW w:w="1985" w:type="dxa"/>
+          </w:tcPr>
+          <w:p>
+            <w:pPr>
+              <w:pStyle w:val="Corpodetexto21"/>
+              <w:ind w:left="0" w:firstLine="0"/>
+              <w:jc w:val="center"/>
+              <w:rPr>
+                <w:rFonts w:ascii="Book Antiqua" w:hAnsi="Book Antiqua"/>
+                <w:sz w:val="20"/>
+              </w:rPr>
+            </w:pPr>
+            <w:r>
+              <w:rPr>
+                <w:rFonts w:ascii="Book Antiqua" w:hAnsi="Book Antiqua"/>
+                <w:sz w:val="20"/>
+              </w:rPr>
+              <w:t>Alta</w:t>
+            </w:r>
+          </w:p>
+        </w:tc>
+        <w:tc>
+          <w:tcPr>
+            <w:tcW w:w="1036" w:type="dxa"/>
+          </w:tcPr>
+          <w:p>
+            <w:pPr>
+              <w:pStyle w:val="Corpodetexto21"/>
+              <w:ind w:left="0" w:firstLine="0"/>
+              <w:rPr>
+                <w:rFonts w:ascii="Book Antiqua" w:hAnsi="Book Antiqua"/>
+                <w:sz w:val="20"/>
+              </w:rPr>
+            </w:pPr>
+            <w:r>
+              <w:rPr>
+                <w:rFonts w:ascii="Symbol" w:hAnsi="Symbol"/>
+                <w:sz w:val="32"/>
+                <w:szCs w:val="32"/>
+              </w:rPr>
+              <w:t>S</w:t>
+            </w:r>
+          </w:p>
+        </w:tc>
+      </w:tr>
+      <w:tr>
+        <w:tc>
+          <w:tcPr>
+            <w:tcW w:w="425" w:type="dxa"/>
+            <w:vMerge w:val="restart"/>
+            <w:textDirection w:val="btLr"/>
+          </w:tcPr>
+          <w:p>
+            <w:pPr>
+              <w:pStyle w:val="Corpodetexto21"/>
+              <w:ind w:left="113" w:right="113" w:firstLine="0"/>
+              <w:rPr>
+                <w:rFonts w:ascii="Book Antiqua" w:hAnsi="Book Antiqua"/>
+                <w:sz w:val="20"/>
+              </w:rPr>
+            </w:pPr>
+            <w:r>
+              <w:rPr>
+                <w:rFonts w:ascii="Book Antiqua" w:hAnsi="Book Antiqua"/>
+                <w:sz w:val="20"/>
+              </w:rPr>
+              <w:t>Interesse</w:t>
+            </w:r>
+          </w:p>
+        </w:tc>
+        <w:tc>
+          <w:tcPr>
+            <w:tcW w:w="1134" w:type="dxa"/>
+          </w:tcPr>
+          <w:p>
+            <w:pPr>
+              <w:pStyle w:val="Corpodetexto21"/>
+              <w:spacing w:line="360" w:lineRule="auto"/>
+              <w:ind w:left="0" w:firstLine="0"/>
+              <w:rPr>
+                <w:rFonts w:ascii="Book Antiqua" w:hAnsi="Book Antiqua"/>
+                <w:sz w:val="20"/>
+              </w:rPr>
+            </w:pPr>
+            <w:r>
+              <w:rPr>
+                <w:rFonts w:ascii="Book Antiqua" w:hAnsi="Book Antiqua"/>
+                <w:sz w:val="20"/>
+              </w:rPr>
+              <w:t>Pouco</w:t>
+            </w:r>
+          </w:p>
+        </w:tc>
+        <w:tc>
+          <w:tcPr>
+            <w:tcW w:w="1701" w:type="dxa"/>
+          </w:tcPr>
+          <w:p>
+            <w:pPr>
+              <w:pStyle w:val="Corpodetexto21"/>
+              <w:spacing w:line="360" w:lineRule="auto"/>
+              <w:ind w:left="0" w:firstLine="0"/>
+              <w:jc w:val="center"/>
+              <w:rPr>
+                <w:rFonts w:ascii="Book Antiqua" w:hAnsi="Book Antiqua"/>
+                <w:sz w:val="20"/>
+              </w:rPr>
+            </w:pPr>
+            <w:r>
+              <w:rPr>
+                <w:rFonts w:ascii="Book Antiqua" w:hAnsi="Book Antiqua"/>
+                <w:sz w:val="20"/>
+              </w:rPr>
+              <w:t>28</w:t>
+            </w:r>
+          </w:p>
+        </w:tc>
+        <w:tc>
+          <w:tcPr>
+            <w:tcW w:w="1843" w:type="dxa"/>
+          </w:tcPr>
+          <w:p>
+            <w:pPr>
+              <w:pStyle w:val="Corpodetexto21"/>
+              <w:spacing w:line="360" w:lineRule="auto"/>
+              <w:ind w:left="0" w:firstLine="0"/>
+              <w:jc w:val="center"/>
+              <w:rPr>
+                <w:rFonts w:ascii="Book Antiqua" w:hAnsi="Book Antiqua"/>
+                <w:sz w:val="20"/>
+              </w:rPr>
+            </w:pPr>
+            <w:r>
+              <w:rPr>
+                <w:rFonts w:ascii="Book Antiqua" w:hAnsi="Book Antiqua"/>
+                <w:sz w:val="20"/>
+              </w:rPr>
+              <w:t>17</w:t>
+            </w:r>
+          </w:p>
+        </w:tc>
+        <w:tc>
+          <w:tcPr>
+            <w:tcW w:w="1985" w:type="dxa"/>
+          </w:tcPr>
+          <w:p>
+            <w:pPr>
+              <w:pStyle w:val="Corpodetexto21"/>
+              <w:spacing w:line="360" w:lineRule="auto"/>
+              <w:ind w:left="0" w:firstLine="0"/>
+              <w:jc w:val="center"/>
+              <w:rPr>
+                <w:rFonts w:ascii="Book Antiqua" w:hAnsi="Book Antiqua"/>
+                <w:sz w:val="20"/>
+              </w:rPr>
+            </w:pPr>
+            <w:r>
+              <w:rPr>
+                <w:rFonts w:ascii="Book Antiqua" w:hAnsi="Book Antiqua"/>
+                <w:sz w:val="20"/>
+              </w:rPr>
+              <w:t>15</w:t>
+            </w:r>
+          </w:p>
+        </w:tc>
+        <w:tc>
+          <w:tcPr>
+            <w:tcW w:w="1036" w:type="dxa"/>
+          </w:tcPr>
+          <w:p>
+            <w:pPr>
+              <w:pStyle w:val="Corpodetexto21"/>
+              <w:spacing w:line="360" w:lineRule="auto"/>
+              <w:ind w:left="0" w:firstLine="0"/>
+              <w:rPr>
+                <w:rFonts w:ascii="Book Antiqua" w:hAnsi="Book Antiqua"/>
+                <w:sz w:val="20"/>
+              </w:rPr>
+            </w:pPr>
+          </w:p>
+        </w:tc>
+      </w:tr>
+      <w:tr>
+        <w:tc>
+          <w:tcPr>
+            <w:tcW w:w="425" w:type="dxa"/>
+            <w:vMerge/>
+          </w:tcPr>
+          <w:p>
+            <w:pPr>
+              <w:pStyle w:val="Corpodetexto21"/>
+              <w:ind w:left="0" w:firstLine="0"/>
+              <w:rPr>
+                <w:rFonts w:ascii="Book Antiqua" w:hAnsi="Book Antiqua"/>
+                <w:sz w:val="20"/>
+              </w:rPr>
+            </w:pPr>
+          </w:p>
+        </w:tc>
+        <w:tc>
+          <w:tcPr>
+            <w:tcW w:w="1134" w:type="dxa"/>
+          </w:tcPr>
+          <w:p>
+            <w:pPr>
+              <w:pStyle w:val="Corpodetexto21"/>
+              <w:spacing w:line="360" w:lineRule="auto"/>
+              <w:ind w:left="0" w:firstLine="0"/>
+              <w:rPr>
+                <w:rFonts w:ascii="Book Antiqua" w:hAnsi="Book Antiqua"/>
+                <w:sz w:val="20"/>
+              </w:rPr>
+            </w:pPr>
+            <w:r>
+              <w:rPr>
+                <w:rFonts w:ascii="Book Antiqua" w:hAnsi="Book Antiqua"/>
+                <w:sz w:val="20"/>
+              </w:rPr>
+              <w:t>Médio</w:t>
+            </w:r>
+          </w:p>
+        </w:tc>
+        <w:tc>
+          <w:tcPr>
+            <w:tcW w:w="1701" w:type="dxa"/>
+          </w:tcPr>
+          <w:p>
+            <w:pPr>
+              <w:pStyle w:val="Corpodetexto21"/>
+              <w:spacing w:line="360" w:lineRule="auto"/>
+              <w:ind w:left="0" w:firstLine="0"/>
+              <w:jc w:val="center"/>
+              <w:rPr>
+                <w:rFonts w:ascii="Book Antiqua" w:hAnsi="Book Antiqua"/>
+                <w:sz w:val="20"/>
+              </w:rPr>
+            </w:pPr>
+            <w:r>
+              <w:rPr>
+                <w:rFonts w:ascii="Book Antiqua" w:hAnsi="Book Antiqua"/>
+                <w:sz w:val="20"/>
+              </w:rPr>
+              <w:t>20</w:t>
+            </w:r>
+          </w:p>
+        </w:tc>
+        <w:tc>
+          <w:tcPr>
+            <w:tcW w:w="1843" w:type="dxa"/>
+          </w:tcPr>
+          <w:p>
+            <w:pPr>
+              <w:pStyle w:val="Corpodetexto21"/>
+              <w:spacing w:line="360" w:lineRule="auto"/>
+              <w:ind w:left="0" w:firstLine="0"/>
+              <w:jc w:val="center"/>
+              <w:rPr>
+                <w:rFonts w:ascii="Book Antiqua" w:hAnsi="Book Antiqua"/>
+                <w:sz w:val="20"/>
+              </w:rPr>
+            </w:pPr>
+            <w:r>
+              <w:rPr>
+                <w:rFonts w:ascii="Book Antiqua" w:hAnsi="Book Antiqua"/>
+                <w:sz w:val="20"/>
+              </w:rPr>
+              <w:t>40</w:t>
+            </w:r>
+          </w:p>
+        </w:tc>
+        <w:tc>
+          <w:tcPr>
+            <w:tcW w:w="1985" w:type="dxa"/>
+          </w:tcPr>
+          <w:p>
+            <w:pPr>
+              <w:pStyle w:val="Corpodetexto21"/>
+              <w:spacing w:line="360" w:lineRule="auto"/>
+              <w:ind w:left="0" w:firstLine="0"/>
+              <w:jc w:val="center"/>
+              <w:rPr>
+                <w:rFonts w:ascii="Book Antiqua" w:hAnsi="Book Antiqua"/>
+                <w:sz w:val="20"/>
+              </w:rPr>
+            </w:pPr>
+            <w:r>
+              <w:rPr>
+                <w:rFonts w:ascii="Book Antiqua" w:hAnsi="Book Antiqua"/>
+                <w:sz w:val="20"/>
+              </w:rPr>
+              <w:t>20</w:t>
+            </w:r>
+          </w:p>
+        </w:tc>
+        <w:tc>
+          <w:tcPr>
+            <w:tcW w:w="1036" w:type="dxa"/>
+          </w:tcPr>
+          <w:p>
+            <w:pPr>
+              <w:pStyle w:val="Corpodetexto21"/>
+              <w:spacing w:line="360" w:lineRule="auto"/>
+              <w:ind w:left="0" w:firstLine="0"/>
+              <w:rPr>
+                <w:rFonts w:ascii="Book Antiqua" w:hAnsi="Book Antiqua"/>
+                <w:sz w:val="20"/>
+              </w:rPr>
+            </w:pPr>
+          </w:p>
+        </w:tc>
+      </w:tr>
+      <w:tr>
+        <w:tc>
+          <w:tcPr>
+            <w:tcW w:w="425" w:type="dxa"/>
+            <w:vMerge/>
+          </w:tcPr>
+          <w:p>
+            <w:pPr>
+              <w:pStyle w:val="Corpodetexto21"/>
+              <w:ind w:left="0" w:firstLine="0"/>
+              <w:rPr>
+                <w:rFonts w:ascii="Book Antiqua" w:hAnsi="Book Antiqua"/>
+                <w:sz w:val="20"/>
+              </w:rPr>
+            </w:pPr>
+          </w:p>
+        </w:tc>
+        <w:tc>
+          <w:tcPr>
+            <w:tcW w:w="1134" w:type="dxa"/>
+          </w:tcPr>
+          <w:p>
+            <w:pPr>
+              <w:pStyle w:val="Corpodetexto21"/>
+              <w:spacing w:line="360" w:lineRule="auto"/>
+              <w:ind w:left="0" w:firstLine="0"/>
+              <w:rPr>
+                <w:rFonts w:ascii="Book Antiqua" w:hAnsi="Book Antiqua"/>
+                <w:sz w:val="20"/>
+              </w:rPr>
+            </w:pPr>
+            <w:r>
+              <w:rPr>
+                <w:rFonts w:ascii="Book Antiqua" w:hAnsi="Book Antiqua"/>
+                <w:sz w:val="20"/>
+              </w:rPr>
+              <w:t>Alto</w:t>
+            </w:r>
+          </w:p>
+        </w:tc>
+        <w:tc>
+          <w:tcPr>
+            <w:tcW w:w="1701" w:type="dxa"/>
+          </w:tcPr>
+          <w:p>
+            <w:pPr>
+              <w:pStyle w:val="Corpodetexto21"/>
+              <w:spacing w:line="360" w:lineRule="auto"/>
+              <w:ind w:left="0" w:firstLine="0"/>
+              <w:jc w:val="center"/>
+              <w:rPr>
+                <w:rFonts w:ascii="Book Antiqua" w:hAnsi="Book Antiqua"/>
+                <w:sz w:val="20"/>
+              </w:rPr>
+            </w:pPr>
+            <w:r>
+              <w:rPr>
+                <w:rFonts w:ascii="Book Antiqua" w:hAnsi="Book Antiqua"/>
+                <w:sz w:val="20"/>
+              </w:rPr>
+              <w:t>12</w:t>
+            </w:r>
+          </w:p>
+        </w:tc>
+        <w:tc>
+          <w:tcPr>
+            <w:tcW w:w="1843" w:type="dxa"/>
+          </w:tcPr>
+          <w:p>
+            <w:pPr>
+              <w:pStyle w:val="Corpodetexto21"/>
+              <w:spacing w:line="360" w:lineRule="auto"/>
+              <w:ind w:left="0" w:firstLine="0"/>
+              <w:jc w:val="center"/>
+              <w:rPr>
+                <w:rFonts w:ascii="Book Antiqua" w:hAnsi="Book Antiqua"/>
+                <w:sz w:val="20"/>
+              </w:rPr>
+            </w:pPr>
+            <w:r>
+              <w:rPr>
+                <w:rFonts w:ascii="Book Antiqua" w:hAnsi="Book Antiqua"/>
+                <w:sz w:val="20"/>
+              </w:rPr>
+              <w:t>28</w:t>
+            </w:r>
+          </w:p>
+        </w:tc>
+        <w:tc>
+          <w:tcPr>
+            <w:tcW w:w="1985" w:type="dxa"/>
+          </w:tcPr>
+          <w:p>
+            <w:pPr>
+              <w:pStyle w:val="Corpodetexto21"/>
+              <w:spacing w:line="360" w:lineRule="auto"/>
+              <w:ind w:left="0" w:firstLine="0"/>
+              <w:jc w:val="center"/>
+              <w:rPr>
+                <w:rFonts w:ascii="Book Antiqua" w:hAnsi="Book Antiqua"/>
+                <w:sz w:val="20"/>
+              </w:rPr>
+            </w:pPr>
+            <w:r>
+              <w:rPr>
+                <w:rFonts w:ascii="Book Antiqua" w:hAnsi="Book Antiqua"/>
+                <w:sz w:val="20"/>
+              </w:rPr>
+              <w:t>40</w:t>
+            </w:r>
+          </w:p>
+        </w:tc>
+        <w:tc>
+          <w:tcPr>
+            <w:tcW w:w="1036" w:type="dxa"/>
+          </w:tcPr>
+          <w:p>
+            <w:pPr>
+              <w:pStyle w:val="Corpodetexto21"/>
+              <w:spacing w:line="360" w:lineRule="auto"/>
+              <w:ind w:left="0" w:firstLine="0"/>
+              <w:rPr>
+                <w:rFonts w:ascii="Book Antiqua" w:hAnsi="Book Antiqua"/>
+                <w:sz w:val="20"/>
+              </w:rPr>
+            </w:pPr>
+          </w:p>
+        </w:tc>
+      </w:tr>
+      <w:tr>
+        <w:tc>
+          <w:tcPr>
+            <w:tcW w:w="1559" w:type="dxa"/>
+            <w:gridSpan w:val="2"/>
+          </w:tcPr>
+          <w:p>
+            <w:pPr>
+              <w:pStyle w:val="Corpodetexto21"/>
+              <w:ind w:left="0" w:firstLine="0"/>
+              <w:rPr>
+                <w:rFonts w:ascii="Symbol" w:hAnsi="Symbol"/>
+                <w:sz w:val="20"/>
+              </w:rPr>
+            </w:pPr>
+            <w:r>
+              <w:rPr>
+                <w:rFonts w:ascii="Symbol" w:hAnsi="Symbol"/>
+                <w:sz w:val="32"/>
+                <w:szCs w:val="32"/>
+              </w:rPr>
+              <w:t>S</w:t>
+            </w:r>
+          </w:p>
+        </w:tc>
+        <w:tc>
+          <w:tcPr>
+            <w:tcW w:w="1701" w:type="dxa"/>
+          </w:tcPr>
+          <w:p>
+            <w:pPr>
+              <w:pStyle w:val="Corpodetexto21"/>
+              <w:ind w:left="0" w:firstLine="0"/>
+              <w:rPr>
+                <w:rFonts w:ascii="Book Antiqua" w:hAnsi="Book Antiqua"/>
+                <w:sz w:val="20"/>
+              </w:rPr>
+            </w:pPr>
+          </w:p>
+        </w:tc>
+        <w:tc>
+          <w:tcPr>
+            <w:tcW w:w="1843" w:type="dxa"/>
+          </w:tcPr>
+          <w:p>
+            <w:pPr>
+              <w:pStyle w:val="Corpodetexto21"/>
+              <w:ind w:left="0" w:firstLine="0"/>
+              <w:rPr>
+                <w:rFonts w:ascii="Book Antiqua" w:hAnsi="Book Antiqua"/>
+                <w:sz w:val="20"/>
+              </w:rPr>
+            </w:pPr>
+          </w:p>
+        </w:tc>
+        <w:tc>
+          <w:tcPr>
+            <w:tcW w:w="1985" w:type="dxa"/>
+          </w:tcPr>
+          <w:p>
+            <w:pPr>
+              <w:pStyle w:val="Corpodetexto21"/>
+              <w:ind w:left="0" w:firstLine="0"/>
+              <w:rPr>
+                <w:rFonts w:ascii="Book Antiqua" w:hAnsi="Book Antiqua"/>
+                <w:sz w:val="20"/>
+              </w:rPr>
+            </w:pPr>
+          </w:p>
+        </w:tc>
+        <w:tc>
+          <w:tcPr>
+            <w:tcW w:w="1036" w:type="dxa"/>
+          </w:tcPr>
+          <w:p>
+            <w:pPr>
+              <w:pStyle w:val="Corpodetexto21"/>
+              <w:ind w:left="0" w:firstLine="0"/>
+              <w:rPr>
+                <w:rFonts w:ascii="Book Antiqua" w:hAnsi="Book Antiqua"/>
+                <w:sz w:val="20"/>
+              </w:rPr>
+            </w:pPr>
+          </w:p>
+        </w:tc>
+      </w:tr>
+    </w:tbl>
+    <w:p>
+      <w:pPr>
+        <w:pStyle w:val="Corpodetexto21"/>
+        <w:spacing w:before="120"/>
+        <w:ind w:left="720" w:firstLine="0"/>
+        <w:rPr>
+          <w:rFonts w:ascii="Book Antiqua" w:hAnsi="Book Antiqua"/>
+          <w:sz w:val="20"/>
+        </w:rPr>
+      </w:pPr>
+    </w:p>
+    <w:p>
+      <w:pPr>
+        <w:pStyle w:val="Corpodetexto21"/>
+        <w:numPr>
+          <w:ilvl w:val="0"/>
+          <w:numId w:val="3"/>
+        </w:numPr>
+        <w:spacing w:before="120"/>
+        <w:rPr>
+          <w:rFonts w:ascii="Book Antiqua" w:hAnsi="Book Antiqua"/>
+          <w:sz w:val="20"/>
+        </w:rPr>
+      </w:pPr>
+      <w:r>
+        <w:rPr>
+          <w:rFonts w:ascii="Book Antiqua" w:hAnsi="Book Antiqua"/>
+          <w:sz w:val="20"/>
+        </w:rPr>
+        <w:t>Num estudo para determinar se há alguma relação entre o padrão de vestuário de funcionários de bancos e sua progressão profissional, uma amostra de tamanho n = 500 forneceu os resultados amostrados abaixo</w:t>
+      </w:r>
+      <w:r>
+        <w:rPr>
+          <w:rFonts w:ascii="Book Antiqua" w:hAnsi="Book Antiqua"/>
+          <w:sz w:val="20"/>
+        </w:rPr>
+        <w:t>:</w:t>
+      </w:r>
+    </w:p>
+    <w:tbl>
+      <w:tblPr>
+        <w:tblStyle w:val="Tabelacomgrade"/>
+        <w:tblW w:w="0" w:type="auto"/>
+        <w:tblInd w:w="1838" w:type="dxa"/>
+        <w:tblLook w:val="04A0" w:firstRow="1" w:lastRow="0" w:firstColumn="1" w:lastColumn="0" w:noHBand="0" w:noVBand="1"/>
+      </w:tblPr>
+      <w:tblGrid>
+        <w:gridCol w:w="477"/>
+        <w:gridCol w:w="1130"/>
+        <w:gridCol w:w="1688"/>
+        <w:gridCol w:w="1830"/>
+        <w:gridCol w:w="1971"/>
+        <w:gridCol w:w="1028"/>
+      </w:tblGrid>
+      <w:tr>
+        <w:tc>
+          <w:tcPr>
+            <w:tcW w:w="1559" w:type="dxa"/>
+            <w:gridSpan w:val="2"/>
+            <w:vMerge w:val="restart"/>
+          </w:tcPr>
+          <w:p>
+            <w:pPr>
+              <w:pStyle w:val="Corpodetexto21"/>
+              <w:ind w:left="0" w:firstLine="0"/>
+              <w:rPr>
+                <w:rFonts w:ascii="Book Antiqua" w:hAnsi="Book Antiqua"/>
+                <w:sz w:val="20"/>
+              </w:rPr>
+            </w:pPr>
+          </w:p>
+        </w:tc>
+        <w:tc>
+          <w:tcPr>
+            <w:tcW w:w="5529" w:type="dxa"/>
+            <w:gridSpan w:val="3"/>
+          </w:tcPr>
+          <w:p>
+            <w:pPr>
+              <w:pStyle w:val="Corpodetexto21"/>
+              <w:ind w:left="0" w:firstLine="0"/>
+              <w:jc w:val="center"/>
+              <w:rPr>
+                <w:rFonts w:ascii="Book Antiqua" w:hAnsi="Book Antiqua"/>
+                <w:sz w:val="20"/>
+              </w:rPr>
+            </w:pPr>
+            <w:r>
+              <w:rPr>
+                <w:rFonts w:ascii="Book Antiqua" w:hAnsi="Book Antiqua"/>
+                <w:sz w:val="20"/>
+              </w:rPr>
+              <w:t>Velocidade de Progressão</w:t>
+            </w:r>
+          </w:p>
+        </w:tc>
+        <w:tc>
+          <w:tcPr>
+            <w:tcW w:w="1036" w:type="dxa"/>
+          </w:tcPr>
+          <w:p>
+            <w:pPr>
+              <w:pStyle w:val="Corpodetexto21"/>
+              <w:ind w:left="0" w:firstLine="0"/>
+              <w:rPr>
+                <w:rFonts w:ascii="Book Antiqua" w:hAnsi="Book Antiqua"/>
+                <w:sz w:val="20"/>
+              </w:rPr>
+            </w:pPr>
+          </w:p>
+        </w:tc>
+      </w:tr>
+      <w:tr>
+        <w:tc>
+          <w:tcPr>
+            <w:tcW w:w="1559" w:type="dxa"/>
+            <w:gridSpan w:val="2"/>
+            <w:vMerge/>
+          </w:tcPr>
+          <w:p>
+            <w:pPr>
+              <w:pStyle w:val="Corpodetexto21"/>
+              <w:ind w:left="0" w:firstLine="0"/>
+              <w:rPr>
+                <w:rFonts w:ascii="Book Antiqua" w:hAnsi="Book Antiqua"/>
+                <w:sz w:val="20"/>
+              </w:rPr>
+            </w:pPr>
+          </w:p>
+        </w:tc>
+        <w:tc>
+          <w:tcPr>
+            <w:tcW w:w="1701" w:type="dxa"/>
+          </w:tcPr>
+          <w:p>
+            <w:pPr>
+              <w:pStyle w:val="Corpodetexto21"/>
+              <w:ind w:left="0" w:firstLine="0"/>
+              <w:jc w:val="center"/>
+              <w:rPr>
+                <w:rFonts w:ascii="Book Antiqua" w:hAnsi="Book Antiqua"/>
+                <w:sz w:val="20"/>
+              </w:rPr>
+            </w:pPr>
+            <w:r>
+              <w:rPr>
+                <w:rFonts w:ascii="Book Antiqua" w:hAnsi="Book Antiqua"/>
+                <w:sz w:val="20"/>
+              </w:rPr>
+              <w:t>Lenta</w:t>
+            </w:r>
+          </w:p>
+        </w:tc>
+        <w:tc>
+          <w:tcPr>
+            <w:tcW w:w="1843" w:type="dxa"/>
+          </w:tcPr>
+          <w:p>
+            <w:pPr>
+              <w:pStyle w:val="Corpodetexto21"/>
+              <w:ind w:left="0" w:firstLine="0"/>
+              <w:jc w:val="center"/>
+              <w:rPr>
+                <w:rFonts w:ascii="Book Antiqua" w:hAnsi="Book Antiqua"/>
+                <w:sz w:val="20"/>
+              </w:rPr>
+            </w:pPr>
+            <w:r>
+              <w:rPr>
+                <w:rFonts w:ascii="Book Antiqua" w:hAnsi="Book Antiqua"/>
+                <w:sz w:val="20"/>
+              </w:rPr>
+              <w:t>Média</w:t>
+            </w:r>
+          </w:p>
+        </w:tc>
+        <w:tc>
+          <w:tcPr>
+            <w:tcW w:w="1985" w:type="dxa"/>
+          </w:tcPr>
+          <w:p>
+            <w:pPr>
+              <w:pStyle w:val="Corpodetexto21"/>
+              <w:ind w:left="0" w:firstLine="0"/>
+              <w:jc w:val="center"/>
+              <w:rPr>
+                <w:rFonts w:ascii="Book Antiqua" w:hAnsi="Book Antiqua"/>
+                <w:sz w:val="20"/>
+              </w:rPr>
+            </w:pPr>
+            <w:r>
+              <w:rPr>
+                <w:rFonts w:ascii="Book Antiqua" w:hAnsi="Book Antiqua"/>
+                <w:sz w:val="20"/>
+              </w:rPr>
+              <w:t>Rápida</w:t>
+            </w:r>
+          </w:p>
+        </w:tc>
+        <w:tc>
+          <w:tcPr>
+            <w:tcW w:w="1036" w:type="dxa"/>
+          </w:tcPr>
+          <w:p>
+            <w:pPr>
+              <w:pStyle w:val="Corpodetexto21"/>
+              <w:ind w:left="0" w:firstLine="0"/>
+              <w:rPr>
+                <w:rFonts w:ascii="Book Antiqua" w:hAnsi="Book Antiqua"/>
+                <w:sz w:val="20"/>
+              </w:rPr>
+            </w:pPr>
+            <w:r>
+              <w:rPr>
+                <w:rFonts w:ascii="Symbol" w:hAnsi="Symbol"/>
+                <w:sz w:val="32"/>
+                <w:szCs w:val="32"/>
+              </w:rPr>
+              <w:t>S</w:t>
+            </w:r>
+          </w:p>
+        </w:tc>
+      </w:tr>
+      <w:tr>
+        <w:tc>
+          <w:tcPr>
+            <w:tcW w:w="425" w:type="dxa"/>
+            <w:vMerge w:val="restart"/>
+            <w:textDirection w:val="btLr"/>
+          </w:tcPr>
+          <w:p>
+            <w:pPr>
+              <w:pStyle w:val="Corpodetexto21"/>
+              <w:ind w:left="113" w:right="113" w:firstLine="0"/>
+              <w:rPr>
+                <w:rFonts w:ascii="Book Antiqua" w:hAnsi="Book Antiqua"/>
+                <w:sz w:val="20"/>
+              </w:rPr>
+            </w:pPr>
+            <w:r>
+              <w:rPr>
+                <w:rFonts w:ascii="Book Antiqua" w:hAnsi="Book Antiqua"/>
+                <w:sz w:val="20"/>
+              </w:rPr>
+              <w:t>Vestuário</w:t>
+            </w:r>
+          </w:p>
+        </w:tc>
+        <w:tc>
+          <w:tcPr>
+            <w:tcW w:w="1134" w:type="dxa"/>
+          </w:tcPr>
+          <w:p>
+            <w:pPr>
+              <w:pStyle w:val="Corpodetexto21"/>
+              <w:spacing w:line="360" w:lineRule="auto"/>
+              <w:ind w:left="0" w:firstLine="0"/>
+              <w:rPr>
+                <w:rFonts w:ascii="Book Antiqua" w:hAnsi="Book Antiqua"/>
+                <w:sz w:val="20"/>
+              </w:rPr>
+            </w:pPr>
+            <w:r>
+              <w:rPr>
+                <w:rFonts w:ascii="Book Antiqua" w:hAnsi="Book Antiqua"/>
+                <w:sz w:val="20"/>
+              </w:rPr>
+              <w:t>Formal</w:t>
+            </w:r>
+          </w:p>
+        </w:tc>
+        <w:tc>
+          <w:tcPr>
+            <w:tcW w:w="1701" w:type="dxa"/>
+          </w:tcPr>
+          <w:p>
+            <w:pPr>
+              <w:pStyle w:val="Corpodetexto21"/>
+              <w:spacing w:line="360" w:lineRule="auto"/>
+              <w:ind w:left="0" w:firstLine="0"/>
+              <w:jc w:val="center"/>
+              <w:rPr>
+                <w:rFonts w:ascii="Book Antiqua" w:hAnsi="Book Antiqua"/>
+                <w:sz w:val="20"/>
+              </w:rPr>
+            </w:pPr>
+            <w:r>
+              <w:rPr>
+                <w:rFonts w:ascii="Book Antiqua" w:hAnsi="Book Antiqua"/>
+                <w:sz w:val="20"/>
+              </w:rPr>
+              <w:t>28</w:t>
+            </w:r>
+          </w:p>
+        </w:tc>
+        <w:tc>
+          <w:tcPr>
+            <w:tcW w:w="1843" w:type="dxa"/>
+          </w:tcPr>
+          <w:p>
+            <w:pPr>
+              <w:pStyle w:val="Corpodetexto21"/>
+              <w:spacing w:line="360" w:lineRule="auto"/>
+              <w:ind w:left="0" w:firstLine="0"/>
+              <w:jc w:val="center"/>
+              <w:rPr>
+                <w:rFonts w:ascii="Book Antiqua" w:hAnsi="Book Antiqua"/>
+                <w:sz w:val="20"/>
+              </w:rPr>
+            </w:pPr>
+            <w:r>
+              <w:rPr>
+                <w:rFonts w:ascii="Book Antiqua" w:hAnsi="Book Antiqua"/>
+                <w:sz w:val="20"/>
+              </w:rPr>
+              <w:t>17</w:t>
+            </w:r>
+          </w:p>
+        </w:tc>
+        <w:tc>
+          <w:tcPr>
+            <w:tcW w:w="1985" w:type="dxa"/>
+          </w:tcPr>
+          <w:p>
+            <w:pPr>
+              <w:pStyle w:val="Corpodetexto21"/>
+              <w:spacing w:line="360" w:lineRule="auto"/>
+              <w:ind w:left="0" w:firstLine="0"/>
+              <w:jc w:val="center"/>
+              <w:rPr>
+                <w:rFonts w:ascii="Book Antiqua" w:hAnsi="Book Antiqua"/>
+                <w:sz w:val="20"/>
+              </w:rPr>
+            </w:pPr>
+            <w:r>
+              <w:rPr>
+                <w:rFonts w:ascii="Book Antiqua" w:hAnsi="Book Antiqua"/>
+                <w:sz w:val="20"/>
+              </w:rPr>
+              <w:t>15</w:t>
+            </w:r>
+          </w:p>
+        </w:tc>
+        <w:tc>
+          <w:tcPr>
+            <w:tcW w:w="1036" w:type="dxa"/>
+          </w:tcPr>
+          <w:p>
+            <w:pPr>
+              <w:pStyle w:val="Corpodetexto21"/>
+              <w:spacing w:line="360" w:lineRule="auto"/>
+              <w:ind w:left="0" w:firstLine="0"/>
+              <w:rPr>
+                <w:rFonts w:ascii="Book Antiqua" w:hAnsi="Book Antiqua"/>
+                <w:sz w:val="20"/>
+              </w:rPr>
+            </w:pPr>
+          </w:p>
+        </w:tc>
+      </w:tr>
+      <w:tr>
+        <w:tc>
+          <w:tcPr>
+            <w:tcW w:w="425" w:type="dxa"/>
+            <w:vMerge/>
+          </w:tcPr>
+          <w:p>
+            <w:pPr>
+              <w:pStyle w:val="Corpodetexto21"/>
+              <w:ind w:left="0" w:firstLine="0"/>
+              <w:rPr>
+                <w:rFonts w:ascii="Book Antiqua" w:hAnsi="Book Antiqua"/>
+                <w:sz w:val="20"/>
+              </w:rPr>
+            </w:pPr>
+          </w:p>
+        </w:tc>
+        <w:tc>
+          <w:tcPr>
+            <w:tcW w:w="1134" w:type="dxa"/>
+          </w:tcPr>
+          <w:p>
+            <w:pPr>
+              <w:pStyle w:val="Corpodetexto21"/>
+              <w:spacing w:line="360" w:lineRule="auto"/>
+              <w:ind w:left="0" w:firstLine="0"/>
+              <w:rPr>
+                <w:rFonts w:ascii="Book Antiqua" w:hAnsi="Book Antiqua"/>
+                <w:sz w:val="20"/>
+              </w:rPr>
+            </w:pPr>
+            <w:r>
+              <w:rPr>
+                <w:rFonts w:ascii="Book Antiqua" w:hAnsi="Book Antiqua"/>
+                <w:sz w:val="20"/>
+              </w:rPr>
+              <w:t>Social</w:t>
+            </w:r>
+          </w:p>
+        </w:tc>
+        <w:tc>
+          <w:tcPr>
+            <w:tcW w:w="1701" w:type="dxa"/>
+          </w:tcPr>
+          <w:p>
+            <w:pPr>
+              <w:pStyle w:val="Corpodetexto21"/>
+              <w:spacing w:line="360" w:lineRule="auto"/>
+              <w:ind w:left="0" w:firstLine="0"/>
+              <w:jc w:val="center"/>
+              <w:rPr>
+                <w:rFonts w:ascii="Book Antiqua" w:hAnsi="Book Antiqua"/>
+                <w:sz w:val="20"/>
+              </w:rPr>
+            </w:pPr>
+            <w:r>
+              <w:rPr>
+                <w:rFonts w:ascii="Book Antiqua" w:hAnsi="Book Antiqua"/>
+                <w:sz w:val="20"/>
+              </w:rPr>
+              <w:t>20</w:t>
+            </w:r>
+          </w:p>
+        </w:tc>
+        <w:tc>
+          <w:tcPr>
+            <w:tcW w:w="1843" w:type="dxa"/>
+          </w:tcPr>
+          <w:p>
+            <w:pPr>
+              <w:pStyle w:val="Corpodetexto21"/>
+              <w:spacing w:line="360" w:lineRule="auto"/>
+              <w:ind w:left="0" w:firstLine="0"/>
+              <w:jc w:val="center"/>
+              <w:rPr>
+                <w:rFonts w:ascii="Book Antiqua" w:hAnsi="Book Antiqua"/>
+                <w:sz w:val="20"/>
+              </w:rPr>
+            </w:pPr>
+            <w:r>
+              <w:rPr>
+                <w:rFonts w:ascii="Book Antiqua" w:hAnsi="Book Antiqua"/>
+                <w:sz w:val="20"/>
+              </w:rPr>
+              <w:t>40</w:t>
+            </w:r>
+          </w:p>
+        </w:tc>
+        <w:tc>
+          <w:tcPr>
+            <w:tcW w:w="1985" w:type="dxa"/>
+          </w:tcPr>
+          <w:p>
+            <w:pPr>
+              <w:pStyle w:val="Corpodetexto21"/>
+              <w:spacing w:line="360" w:lineRule="auto"/>
+              <w:ind w:left="0" w:firstLine="0"/>
+              <w:jc w:val="center"/>
+              <w:rPr>
+                <w:rFonts w:ascii="Book Antiqua" w:hAnsi="Book Antiqua"/>
+                <w:sz w:val="20"/>
+              </w:rPr>
+            </w:pPr>
+            <w:r>
+              <w:rPr>
+                <w:rFonts w:ascii="Book Antiqua" w:hAnsi="Book Antiqua"/>
+                <w:sz w:val="20"/>
+              </w:rPr>
+              <w:t>20</w:t>
+            </w:r>
+          </w:p>
+        </w:tc>
+        <w:tc>
+          <w:tcPr>
+            <w:tcW w:w="1036" w:type="dxa"/>
+          </w:tcPr>
+          <w:p>
+            <w:pPr>
+              <w:pStyle w:val="Corpodetexto21"/>
+              <w:spacing w:line="360" w:lineRule="auto"/>
+              <w:ind w:left="0" w:firstLine="0"/>
+              <w:rPr>
+                <w:rFonts w:ascii="Book Antiqua" w:hAnsi="Book Antiqua"/>
+                <w:sz w:val="20"/>
+              </w:rPr>
+            </w:pPr>
+          </w:p>
+        </w:tc>
+      </w:tr>
+      <w:tr>
+        <w:tc>
+          <w:tcPr>
+            <w:tcW w:w="425" w:type="dxa"/>
+            <w:vMerge/>
+          </w:tcPr>
+          <w:p>
+            <w:pPr>
+              <w:pStyle w:val="Corpodetexto21"/>
+              <w:ind w:left="0" w:firstLine="0"/>
+              <w:rPr>
+                <w:rFonts w:ascii="Book Antiqua" w:hAnsi="Book Antiqua"/>
+                <w:sz w:val="20"/>
+              </w:rPr>
+            </w:pPr>
+          </w:p>
+        </w:tc>
+        <w:tc>
+          <w:tcPr>
+            <w:tcW w:w="1134" w:type="dxa"/>
+          </w:tcPr>
+          <w:p>
+            <w:pPr>
+              <w:pStyle w:val="Corpodetexto21"/>
+              <w:spacing w:line="360" w:lineRule="auto"/>
+              <w:ind w:left="0" w:firstLine="0"/>
+              <w:rPr>
+                <w:rFonts w:ascii="Book Antiqua" w:hAnsi="Book Antiqua"/>
+                <w:sz w:val="20"/>
+              </w:rPr>
+            </w:pPr>
+            <w:r>
+              <w:rPr>
+                <w:rFonts w:ascii="Book Antiqua" w:hAnsi="Book Antiqua"/>
+                <w:sz w:val="20"/>
+              </w:rPr>
+              <w:t>Casual</w:t>
+            </w:r>
+          </w:p>
+        </w:tc>
+        <w:tc>
+          <w:tcPr>
+            <w:tcW w:w="1701" w:type="dxa"/>
+          </w:tcPr>
+          <w:p>
+            <w:pPr>
+              <w:pStyle w:val="Corpodetexto21"/>
+              <w:spacing w:line="360" w:lineRule="auto"/>
+              <w:ind w:left="0" w:firstLine="0"/>
+              <w:jc w:val="center"/>
+              <w:rPr>
+                <w:rFonts w:ascii="Book Antiqua" w:hAnsi="Book Antiqua"/>
+                <w:sz w:val="20"/>
+              </w:rPr>
+            </w:pPr>
+            <w:r>
+              <w:rPr>
+                <w:rFonts w:ascii="Book Antiqua" w:hAnsi="Book Antiqua"/>
+                <w:sz w:val="20"/>
+              </w:rPr>
+              <w:t>12</w:t>
+            </w:r>
+          </w:p>
+        </w:tc>
+        <w:tc>
+          <w:tcPr>
+            <w:tcW w:w="1843" w:type="dxa"/>
+          </w:tcPr>
+          <w:p>
+            <w:pPr>
+              <w:pStyle w:val="Corpodetexto21"/>
+              <w:spacing w:line="360" w:lineRule="auto"/>
+              <w:ind w:left="0" w:firstLine="0"/>
+              <w:jc w:val="center"/>
+              <w:rPr>
+                <w:rFonts w:ascii="Book Antiqua" w:hAnsi="Book Antiqua"/>
+                <w:sz w:val="20"/>
+              </w:rPr>
+            </w:pPr>
+            <w:r>
+              <w:rPr>
+                <w:rFonts w:ascii="Book Antiqua" w:hAnsi="Book Antiqua"/>
+                <w:sz w:val="20"/>
+              </w:rPr>
+              <w:t>28</w:t>
+            </w:r>
+          </w:p>
+        </w:tc>
+        <w:tc>
+          <w:tcPr>
+            <w:tcW w:w="1985" w:type="dxa"/>
+          </w:tcPr>
+          <w:p>
+            <w:pPr>
+              <w:pStyle w:val="Corpodetexto21"/>
+              <w:spacing w:line="360" w:lineRule="auto"/>
+              <w:ind w:left="0" w:firstLine="0"/>
+              <w:jc w:val="center"/>
+              <w:rPr>
+                <w:rFonts w:ascii="Book Antiqua" w:hAnsi="Book Antiqua"/>
+                <w:sz w:val="20"/>
+              </w:rPr>
+            </w:pPr>
+            <w:r>
+              <w:rPr>
+                <w:rFonts w:ascii="Book Antiqua" w:hAnsi="Book Antiqua"/>
+                <w:sz w:val="20"/>
+              </w:rPr>
+              <w:t>40</w:t>
+            </w:r>
+          </w:p>
+        </w:tc>
+        <w:tc>
+          <w:tcPr>
+            <w:tcW w:w="1036" w:type="dxa"/>
+          </w:tcPr>
+          <w:p>
+            <w:pPr>
+              <w:pStyle w:val="Corpodetexto21"/>
+              <w:spacing w:line="360" w:lineRule="auto"/>
+              <w:ind w:left="0" w:firstLine="0"/>
+              <w:rPr>
+                <w:rFonts w:ascii="Book Antiqua" w:hAnsi="Book Antiqua"/>
+                <w:sz w:val="20"/>
+              </w:rPr>
+            </w:pPr>
+          </w:p>
+        </w:tc>
+      </w:tr>
+      <w:tr>
+        <w:tc>
+          <w:tcPr>
+            <w:tcW w:w="1559" w:type="dxa"/>
+            <w:gridSpan w:val="2"/>
+          </w:tcPr>
+          <w:p>
+            <w:pPr>
+              <w:pStyle w:val="Corpodetexto21"/>
+              <w:ind w:left="0" w:firstLine="0"/>
+              <w:rPr>
+                <w:rFonts w:ascii="Symbol" w:hAnsi="Symbol"/>
+                <w:sz w:val="20"/>
+              </w:rPr>
+            </w:pPr>
+            <w:r>
+              <w:rPr>
+                <w:rFonts w:ascii="Symbol" w:hAnsi="Symbol"/>
+                <w:sz w:val="32"/>
+                <w:szCs w:val="32"/>
+              </w:rPr>
+              <w:t>S</w:t>
+            </w:r>
+          </w:p>
+        </w:tc>
+        <w:tc>
+          <w:tcPr>
+            <w:tcW w:w="1701" w:type="dxa"/>
+          </w:tcPr>
+          <w:p>
+            <w:pPr>
+              <w:pStyle w:val="Corpodetexto21"/>
+              <w:ind w:left="0" w:firstLine="0"/>
+              <w:rPr>
+                <w:rFonts w:ascii="Book Antiqua" w:hAnsi="Book Antiqua"/>
+                <w:sz w:val="20"/>
+              </w:rPr>
+            </w:pPr>
+          </w:p>
+        </w:tc>
+        <w:tc>
+          <w:tcPr>
+            <w:tcW w:w="1843" w:type="dxa"/>
+          </w:tcPr>
+          <w:p>
+            <w:pPr>
+              <w:pStyle w:val="Corpodetexto21"/>
+              <w:ind w:left="0" w:firstLine="0"/>
+              <w:rPr>
+                <w:rFonts w:ascii="Book Antiqua" w:hAnsi="Book Antiqua"/>
+                <w:sz w:val="20"/>
+              </w:rPr>
+            </w:pPr>
+          </w:p>
+        </w:tc>
+        <w:tc>
+          <w:tcPr>
+            <w:tcW w:w="1985" w:type="dxa"/>
+          </w:tcPr>
+          <w:p>
+            <w:pPr>
+              <w:pStyle w:val="Corpodetexto21"/>
+              <w:ind w:left="0" w:firstLine="0"/>
+              <w:rPr>
+                <w:rFonts w:ascii="Book Antiqua" w:hAnsi="Book Antiqua"/>
+                <w:sz w:val="20"/>
+              </w:rPr>
+            </w:pPr>
+          </w:p>
+        </w:tc>
+        <w:tc>
+          <w:tcPr>
+            <w:tcW w:w="1036" w:type="dxa"/>
+          </w:tcPr>
+          <w:p>
+            <w:pPr>
+              <w:pStyle w:val="Corpodetexto21"/>
+              <w:ind w:left="0" w:firstLine="0"/>
+              <w:rPr>
+                <w:rFonts w:ascii="Book Antiqua" w:hAnsi="Book Antiqua"/>
+                <w:sz w:val="20"/>
+              </w:rPr>
+            </w:pPr>
+          </w:p>
+        </w:tc>
+      </w:tr>
+    </w:tbl>
+    <w:p>
+      <w:pPr>
+        <w:pStyle w:val="Corpodetexto21"/>
+        <w:tabs>
+          <w:tab w:val="clear" w:pos="426"/>
+          <w:tab w:val="left" w:pos="993"/>
+        </w:tabs>
+        <w:spacing w:before="120"/>
+        <w:ind w:firstLine="0"/>
+        <w:rPr>
+          <w:rFonts w:ascii="Book Antiqua" w:hAnsi="Book Antiqua"/>
+          <w:sz w:val="20"/>
+        </w:rPr>
+      </w:pPr>
+      <w:r>
+        <w:rPr>
+          <w:rFonts w:ascii="Book Antiqua" w:hAnsi="Book Antiqua"/>
+          <w:sz w:val="20"/>
+        </w:rPr>
+        <w:t xml:space="preserve">Use o nível de 5% de </w:t>
+      </w:r>
+      <w:r>
+        <w:rPr>
+          <w:rFonts w:ascii="Book Antiqua" w:hAnsi="Book Antiqua"/>
+          <w:sz w:val="20"/>
+        </w:rPr>
+        <w:tab/>
+        <w:t>significância para testar se realmente há relação entre o padrão de vestuário dos funcionários de bancos e sua progressão profissional.</w:t>
+      </w:r>
+    </w:p>
+    <w:p>
+      <w:pPr>
+        <w:pStyle w:val="Corpodetexto21"/>
+        <w:numPr>
+          <w:ilvl w:val="0"/>
+          <w:numId w:val="3"/>
+        </w:numPr>
+        <w:spacing w:before="120"/>
+        <w:rPr>
+          <w:rFonts w:ascii="Book Antiqua" w:hAnsi="Book Antiqua"/>
+          <w:sz w:val="20"/>
+        </w:rPr>
+      </w:pPr>
+      <w:r>
+        <w:rPr>
+          <w:rFonts w:ascii="Book Antiqua" w:hAnsi="Book Antiqua"/>
+          <w:sz w:val="20"/>
+        </w:rPr>
+        <w:t>Suponha que se deseja comparar a eficiência de dois programas de investimento no desempenho financeiro de pequenas empresas. Para realizar o experimento, dispõe-se de 10 empresas com características semelhantes. As empresas foram sorteadas aleatoriamente em dois grupos de cinco empresas. Um grupo recebeu o programa de investimento A, enquanto o outro recebeu o programa de investimento B. A eficiência dos programas foi avaliada pelo crescimento percentual do faturamento de cada empresa durante determinado período</w:t>
       </w:r>
     </w:p>
     <w:tbl>
@@ -1023,6 +2965,7 @@
                 <w:sz w:val="18"/>
                 <w:szCs w:val="18"/>
               </w:rPr>
+              <w:lastRenderedPageBreak/>
               <w:t>Investimento</w:t>
             </w:r>
           </w:p>
@@ -1810,7 +3753,7 @@
           <v:shape id="_x0000_i1025" type="#_x0000_t75" style="width:17.65pt;height:17.65pt" o:ole="" fillcolor="window">
             <v:imagedata r:id="rId5" o:title=""/>
           </v:shape>
-          <o:OLEObject Type="Embed" ProgID="Equation.2" ShapeID="_x0000_i1025" DrawAspect="Content" ObjectID="_1849245993" r:id="rId6"/>
+          <o:OLEObject Type="Embed" ProgID="Equation.2" ShapeID="_x0000_i1025" DrawAspect="Content" ObjectID="_1849531258" r:id="rId6"/>
         </w:object>
       </w:r>
       <w:r>
@@ -1832,7 +3775,7 @@
           <v:shape id="_x0000_i1026" type="#_x0000_t75" style="width:16.8pt;height:17.65pt" o:ole="" fillcolor="window">
             <v:imagedata r:id="rId7" o:title=""/>
           </v:shape>
-          <o:OLEObject Type="Embed" ProgID="Equation.2" ShapeID="_x0000_i1026" DrawAspect="Content" ObjectID="_1849245994" r:id="rId8"/>
+          <o:OLEObject Type="Embed" ProgID="Equation.2" ShapeID="_x0000_i1026" DrawAspect="Content" ObjectID="_1849531259" r:id="rId8"/>
         </w:object>
       </w:r>
       <w:r>
@@ -1871,7 +3814,7 @@
           <v:shape id="_x0000_i1027" type="#_x0000_t75" style="width:17.65pt;height:17.65pt" o:ole="" fillcolor="window">
             <v:imagedata r:id="rId9" o:title=""/>
           </v:shape>
-          <o:OLEObject Type="Embed" ProgID="Equation.2" ShapeID="_x0000_i1027" DrawAspect="Content" ObjectID="_1849245995" r:id="rId10"/>
+          <o:OLEObject Type="Embed" ProgID="Equation.2" ShapeID="_x0000_i1027" DrawAspect="Content" ObjectID="_1849531260" r:id="rId10"/>
         </w:object>
       </w:r>
       <w:r>
@@ -1885,7 +3828,7 @@
           <v:shape id="_x0000_i1028" type="#_x0000_t75" style="width:28.25pt;height:17.65pt" o:ole="" fillcolor="window">
             <v:imagedata r:id="rId11" o:title=""/>
           </v:shape>
-          <o:OLEObject Type="Embed" ProgID="Equation.2" ShapeID="_x0000_i1028" DrawAspect="Content" ObjectID="_1849245996" r:id="rId12"/>
+          <o:OLEObject Type="Embed" ProgID="Equation.2" ShapeID="_x0000_i1028" DrawAspect="Content" ObjectID="_1849531261" r:id="rId12"/>
         </w:object>
       </w:r>
       <w:r>
@@ -5280,6 +7223,95 @@
     </w:lvl>
   </w:abstractNum>
   <w:abstractNum w:abstractNumId="1" w15:restartNumberingAfterBreak="0">
+    <w:nsid w:val="1A427D73"/>
+    <w:multiLevelType w:val="hybridMultilevel"/>
+    <w:tmpl w:val="AFDC19C4"/>
+    <w:lvl w:ilvl="0" w:tplc="04160017">
+      <w:start w:val="1"/>
+      <w:numFmt w:val="lowerLetter"/>
+      <w:lvlText w:val="%1)"/>
+      <w:lvlJc w:val="left"/>
+      <w:pPr>
+        <w:ind w:left="720" w:hanging="360"/>
+      </w:pPr>
+      <w:rPr>
+        <w:rFonts w:hint="default"/>
+      </w:rPr>
+    </w:lvl>
+    <w:lvl w:ilvl="1" w:tplc="04160019" w:tentative="1">
+      <w:start w:val="1"/>
+      <w:numFmt w:val="lowerLetter"/>
+      <w:lvlText w:val="%2."/>
+      <w:lvlJc w:val="left"/>
+      <w:pPr>
+        <w:ind w:left="1440" w:hanging="360"/>
+      </w:pPr>
+    </w:lvl>
+    <w:lvl w:ilvl="2" w:tplc="0416001B" w:tentative="1">
+      <w:start w:val="1"/>
+      <w:numFmt w:val="lowerRoman"/>
+      <w:lvlText w:val="%3."/>
+      <w:lvlJc w:val="right"/>
+      <w:pPr>
+        <w:ind w:left="2160" w:hanging="180"/>
+      </w:pPr>
+    </w:lvl>
+    <w:lvl w:ilvl="3" w:tplc="0416000F" w:tentative="1">
+      <w:start w:val="1"/>
+      <w:numFmt w:val="decimal"/>
+      <w:lvlText w:val="%4."/>
+      <w:lvlJc w:val="left"/>
+      <w:pPr>
+        <w:ind w:left="2880" w:hanging="360"/>
+      </w:pPr>
+    </w:lvl>
+    <w:lvl w:ilvl="4" w:tplc="04160019" w:tentative="1">
+      <w:start w:val="1"/>
+      <w:numFmt w:val="lowerLetter"/>
+      <w:lvlText w:val="%5."/>
+      <w:lvlJc w:val="left"/>
+      <w:pPr>
+        <w:ind w:left="3600" w:hanging="360"/>
+      </w:pPr>
+    </w:lvl>
+    <w:lvl w:ilvl="5" w:tplc="0416001B" w:tentative="1">
+      <w:start w:val="1"/>
+      <w:numFmt w:val="lowerRoman"/>
+      <w:lvlText w:val="%6."/>
+      <w:lvlJc w:val="right"/>
+      <w:pPr>
+        <w:ind w:left="4320" w:hanging="180"/>
+      </w:pPr>
+    </w:lvl>
+    <w:lvl w:ilvl="6" w:tplc="0416000F" w:tentative="1">
+      <w:start w:val="1"/>
+      <w:numFmt w:val="decimal"/>
+      <w:lvlText w:val="%7."/>
+      <w:lvlJc w:val="left"/>
+      <w:pPr>
+        <w:ind w:left="5040" w:hanging="360"/>
+      </w:pPr>
+    </w:lvl>
+    <w:lvl w:ilvl="7" w:tplc="04160019" w:tentative="1">
+      <w:start w:val="1"/>
+      <w:numFmt w:val="lowerLetter"/>
+      <w:lvlText w:val="%8."/>
+      <w:lvlJc w:val="left"/>
+      <w:pPr>
+        <w:ind w:left="5760" w:hanging="360"/>
+      </w:pPr>
+    </w:lvl>
+    <w:lvl w:ilvl="8" w:tplc="0416001B" w:tentative="1">
+      <w:start w:val="1"/>
+      <w:numFmt w:val="lowerRoman"/>
+      <w:lvlText w:val="%9."/>
+      <w:lvlJc w:val="right"/>
+      <w:pPr>
+        <w:ind w:left="6480" w:hanging="180"/>
+      </w:pPr>
+    </w:lvl>
+  </w:abstractNum>
+  <w:abstractNum w:abstractNumId="2" w15:restartNumberingAfterBreak="0">
     <w:nsid w:val="5C2A7976"/>
     <w:multiLevelType w:val="hybridMultilevel"/>
     <w:tmpl w:val="878C6B46"/>
@@ -5368,10 +7400,105 @@
       </w:pPr>
     </w:lvl>
   </w:abstractNum>
+  <w:abstractNum w:abstractNumId="3" w15:restartNumberingAfterBreak="0">
+    <w:nsid w:val="70554BF0"/>
+    <w:multiLevelType w:val="hybridMultilevel"/>
+    <w:tmpl w:val="5B0C405A"/>
+    <w:lvl w:ilvl="0" w:tplc="04160011">
+      <w:start w:val="1"/>
+      <w:numFmt w:val="decimal"/>
+      <w:lvlText w:val="%1)"/>
+      <w:lvlJc w:val="left"/>
+      <w:pPr>
+        <w:ind w:left="720" w:hanging="360"/>
+      </w:pPr>
+      <w:rPr>
+        <w:rFonts w:hint="default"/>
+      </w:rPr>
+    </w:lvl>
+    <w:lvl w:ilvl="1" w:tplc="04160019" w:tentative="1">
+      <w:start w:val="1"/>
+      <w:numFmt w:val="lowerLetter"/>
+      <w:lvlText w:val="%2."/>
+      <w:lvlJc w:val="left"/>
+      <w:pPr>
+        <w:ind w:left="1440" w:hanging="360"/>
+      </w:pPr>
+    </w:lvl>
+    <w:lvl w:ilvl="2" w:tplc="0416001B" w:tentative="1">
+      <w:start w:val="1"/>
+      <w:numFmt w:val="lowerRoman"/>
+      <w:lvlText w:val="%3."/>
+      <w:lvlJc w:val="right"/>
+      <w:pPr>
+        <w:ind w:left="2160" w:hanging="180"/>
+      </w:pPr>
+    </w:lvl>
+    <w:lvl w:ilvl="3" w:tplc="0416000F" w:tentative="1">
+      <w:start w:val="1"/>
+      <w:numFmt w:val="decimal"/>
+      <w:lvlText w:val="%4."/>
+      <w:lvlJc w:val="left"/>
+      <w:pPr>
+        <w:ind w:left="2880" w:hanging="360"/>
+      </w:pPr>
+    </w:lvl>
+    <w:lvl w:ilvl="4" w:tplc="04160019" w:tentative="1">
+      <w:start w:val="1"/>
+      <w:numFmt w:val="lowerLetter"/>
+      <w:lvlText w:val="%5."/>
+      <w:lvlJc w:val="left"/>
+      <w:pPr>
+        <w:ind w:left="3600" w:hanging="360"/>
+      </w:pPr>
+    </w:lvl>
+    <w:lvl w:ilvl="5" w:tplc="0416001B" w:tentative="1">
+      <w:start w:val="1"/>
+      <w:numFmt w:val="lowerRoman"/>
+      <w:lvlText w:val="%6."/>
+      <w:lvlJc w:val="right"/>
+      <w:pPr>
+        <w:ind w:left="4320" w:hanging="180"/>
+      </w:pPr>
+    </w:lvl>
+    <w:lvl w:ilvl="6" w:tplc="0416000F" w:tentative="1">
+      <w:start w:val="1"/>
+      <w:numFmt w:val="decimal"/>
+      <w:lvlText w:val="%7."/>
+      <w:lvlJc w:val="left"/>
+      <w:pPr>
+        <w:ind w:left="5040" w:hanging="360"/>
+      </w:pPr>
+    </w:lvl>
+    <w:lvl w:ilvl="7" w:tplc="04160019" w:tentative="1">
+      <w:start w:val="1"/>
+      <w:numFmt w:val="lowerLetter"/>
+      <w:lvlText w:val="%8."/>
+      <w:lvlJc w:val="left"/>
+      <w:pPr>
+        <w:ind w:left="5760" w:hanging="360"/>
+      </w:pPr>
+    </w:lvl>
+    <w:lvl w:ilvl="8" w:tplc="0416001B" w:tentative="1">
+      <w:start w:val="1"/>
+      <w:numFmt w:val="lowerRoman"/>
+      <w:lvlText w:val="%9."/>
+      <w:lvlJc w:val="right"/>
+      <w:pPr>
+        <w:ind w:left="6480" w:hanging="180"/>
+      </w:pPr>
+    </w:lvl>
+  </w:abstractNum>
   <w:num w:numId="1" w16cid:durableId="861280177">
     <w:abstractNumId w:val="0"/>
   </w:num>
   <w:num w:numId="2" w16cid:durableId="641273759">
+    <w:abstractNumId w:val="2"/>
+  </w:num>
+  <w:num w:numId="3" w16cid:durableId="499010435">
+    <w:abstractNumId w:val="3"/>
+  </w:num>
+  <w:num w:numId="4" w16cid:durableId="346296766">
     <w:abstractNumId w:val="1"/>
   </w:num>
 </w:numbering>

</xml_diff>